<commit_message>
chore: update CV files in both .docx and .pdf formats
</commit_message>
<xml_diff>
--- a/CV_Siarhei_Yemialyanau.docx
+++ b/CV_Siarhei_Yemialyanau.docx
@@ -1056,7 +1056,7 @@
           <w:color w:val="222222"/>
           <w:sz w:val="21"/>
         </w:rPr>
-        <w:t>Designed and built full-stack web applications (Node.js, Express, MongoDB, React) for personal ventures.</w:t>
+        <w:t>Engineered and built full-stack web applications (Node.js, Express, MongoDB, React) for personal ventures.</w:t>
       </w:r>
     </w:p>
     <w:p>
@@ -1116,7 +1116,7 @@
           <w:color w:val="222222"/>
           <w:sz w:val="21"/>
         </w:rPr>
-        <w:t>Designed and built a full-stack university scheduling system end to end: a React/TypeScript web client, a React Native mobile app (iOS/Android), a Node.js/Express backend, and Firebase Realtime Database/MongoDB for live and archived data.</w:t>
+        <w:t>Engineered and built a full-stack university scheduling system end to end: a React/TypeScript web client, a React Native mobile app (iOS/Android), a Node.js/Express backend, and Firebase Realtime Database/MongoDB for live and archived data.</w:t>
       </w:r>
     </w:p>
     <w:p>
@@ -1596,6 +1596,7 @@
         </w:tabs>
         <w:ind w:left="1080" w:hanging="360"/>
       </w:pPr>
+      <w:rPr/>
     </w:lvl>
     <w:lvl w:ilvl="2">
       <w:start w:val="1"/>
@@ -1608,6 +1609,7 @@
         </w:tabs>
         <w:ind w:left="1440" w:hanging="360"/>
       </w:pPr>
+      <w:rPr/>
     </w:lvl>
     <w:lvl w:ilvl="3">
       <w:start w:val="1"/>
@@ -1620,6 +1622,7 @@
         </w:tabs>
         <w:ind w:left="1800" w:hanging="360"/>
       </w:pPr>
+      <w:rPr/>
     </w:lvl>
     <w:lvl w:ilvl="4">
       <w:start w:val="1"/>
@@ -1632,6 +1635,7 @@
         </w:tabs>
         <w:ind w:left="2160" w:hanging="360"/>
       </w:pPr>
+      <w:rPr/>
     </w:lvl>
     <w:lvl w:ilvl="5">
       <w:start w:val="1"/>
@@ -1644,6 +1648,7 @@
         </w:tabs>
         <w:ind w:left="2520" w:hanging="360"/>
       </w:pPr>
+      <w:rPr/>
     </w:lvl>
     <w:lvl w:ilvl="6">
       <w:start w:val="1"/>
@@ -1656,6 +1661,7 @@
         </w:tabs>
         <w:ind w:left="2880" w:hanging="360"/>
       </w:pPr>
+      <w:rPr/>
     </w:lvl>
     <w:lvl w:ilvl="7">
       <w:start w:val="1"/>
@@ -1668,6 +1674,7 @@
         </w:tabs>
         <w:ind w:left="3240" w:hanging="360"/>
       </w:pPr>
+      <w:rPr/>
     </w:lvl>
     <w:lvl w:ilvl="8">
       <w:start w:val="1"/>
@@ -1680,6 +1687,7 @@
         </w:tabs>
         <w:ind w:left="3600" w:hanging="360"/>
       </w:pPr>
+      <w:rPr/>
     </w:lvl>
   </w:abstractNum>
   <w:abstractNum w:abstractNumId="2">
@@ -1709,6 +1717,7 @@
         </w:tabs>
         <w:ind w:left="1080" w:hanging="360"/>
       </w:pPr>
+      <w:rPr/>
     </w:lvl>
     <w:lvl w:ilvl="2">
       <w:start w:val="1"/>
@@ -1721,6 +1730,7 @@
         </w:tabs>
         <w:ind w:left="1440" w:hanging="360"/>
       </w:pPr>
+      <w:rPr/>
     </w:lvl>
     <w:lvl w:ilvl="3">
       <w:start w:val="1"/>
@@ -1733,6 +1743,7 @@
         </w:tabs>
         <w:ind w:left="1800" w:hanging="360"/>
       </w:pPr>
+      <w:rPr/>
     </w:lvl>
     <w:lvl w:ilvl="4">
       <w:start w:val="1"/>
@@ -1745,6 +1756,7 @@
         </w:tabs>
         <w:ind w:left="2160" w:hanging="360"/>
       </w:pPr>
+      <w:rPr/>
     </w:lvl>
     <w:lvl w:ilvl="5">
       <w:start w:val="1"/>
@@ -1757,6 +1769,7 @@
         </w:tabs>
         <w:ind w:left="2520" w:hanging="360"/>
       </w:pPr>
+      <w:rPr/>
     </w:lvl>
     <w:lvl w:ilvl="6">
       <w:start w:val="1"/>
@@ -1769,6 +1782,7 @@
         </w:tabs>
         <w:ind w:left="2880" w:hanging="360"/>
       </w:pPr>
+      <w:rPr/>
     </w:lvl>
     <w:lvl w:ilvl="7">
       <w:start w:val="1"/>
@@ -1781,6 +1795,7 @@
         </w:tabs>
         <w:ind w:left="3240" w:hanging="360"/>
       </w:pPr>
+      <w:rPr/>
     </w:lvl>
     <w:lvl w:ilvl="8">
       <w:start w:val="1"/>
@@ -1793,6 +1808,7 @@
         </w:tabs>
         <w:ind w:left="3600" w:hanging="360"/>
       </w:pPr>
+      <w:rPr/>
     </w:lvl>
   </w:abstractNum>
   <w:abstractNum w:abstractNumId="3">
@@ -1822,6 +1838,7 @@
         </w:tabs>
         <w:ind w:left="1080" w:hanging="360"/>
       </w:pPr>
+      <w:rPr/>
     </w:lvl>
     <w:lvl w:ilvl="2">
       <w:start w:val="1"/>
@@ -1834,6 +1851,7 @@
         </w:tabs>
         <w:ind w:left="1440" w:hanging="360"/>
       </w:pPr>
+      <w:rPr/>
     </w:lvl>
     <w:lvl w:ilvl="3">
       <w:start w:val="1"/>
@@ -1846,6 +1864,7 @@
         </w:tabs>
         <w:ind w:left="1800" w:hanging="360"/>
       </w:pPr>
+      <w:rPr/>
     </w:lvl>
     <w:lvl w:ilvl="4">
       <w:start w:val="1"/>
@@ -1858,6 +1877,7 @@
         </w:tabs>
         <w:ind w:left="2160" w:hanging="360"/>
       </w:pPr>
+      <w:rPr/>
     </w:lvl>
     <w:lvl w:ilvl="5">
       <w:start w:val="1"/>
@@ -1870,6 +1890,7 @@
         </w:tabs>
         <w:ind w:left="2520" w:hanging="360"/>
       </w:pPr>
+      <w:rPr/>
     </w:lvl>
     <w:lvl w:ilvl="6">
       <w:start w:val="1"/>
@@ -1882,6 +1903,7 @@
         </w:tabs>
         <w:ind w:left="2880" w:hanging="360"/>
       </w:pPr>
+      <w:rPr/>
     </w:lvl>
     <w:lvl w:ilvl="7">
       <w:start w:val="1"/>
@@ -1894,6 +1916,7 @@
         </w:tabs>
         <w:ind w:left="3240" w:hanging="360"/>
       </w:pPr>
+      <w:rPr/>
     </w:lvl>
     <w:lvl w:ilvl="8">
       <w:start w:val="1"/>
@@ -1906,6 +1929,7 @@
         </w:tabs>
         <w:ind w:left="3600" w:hanging="360"/>
       </w:pPr>
+      <w:rPr/>
     </w:lvl>
   </w:abstractNum>
   <w:abstractNum w:abstractNumId="4">
@@ -1933,6 +1957,7 @@
         </w:tabs>
         <w:ind w:left="1080" w:hanging="360"/>
       </w:pPr>
+      <w:rPr/>
     </w:lvl>
     <w:lvl w:ilvl="2">
       <w:start w:val="1"/>
@@ -1945,6 +1970,7 @@
         </w:tabs>
         <w:ind w:left="1440" w:hanging="360"/>
       </w:pPr>
+      <w:rPr/>
     </w:lvl>
     <w:lvl w:ilvl="3">
       <w:start w:val="1"/>
@@ -1957,6 +1983,7 @@
         </w:tabs>
         <w:ind w:left="1800" w:hanging="360"/>
       </w:pPr>
+      <w:rPr/>
     </w:lvl>
     <w:lvl w:ilvl="4">
       <w:start w:val="1"/>
@@ -1969,6 +1996,7 @@
         </w:tabs>
         <w:ind w:left="2160" w:hanging="360"/>
       </w:pPr>
+      <w:rPr/>
     </w:lvl>
     <w:lvl w:ilvl="5">
       <w:start w:val="1"/>
@@ -1981,6 +2009,7 @@
         </w:tabs>
         <w:ind w:left="2520" w:hanging="360"/>
       </w:pPr>
+      <w:rPr/>
     </w:lvl>
     <w:lvl w:ilvl="6">
       <w:start w:val="1"/>
@@ -1993,6 +2022,7 @@
         </w:tabs>
         <w:ind w:left="2880" w:hanging="360"/>
       </w:pPr>
+      <w:rPr/>
     </w:lvl>
     <w:lvl w:ilvl="7">
       <w:start w:val="1"/>
@@ -2005,6 +2035,7 @@
         </w:tabs>
         <w:ind w:left="3240" w:hanging="360"/>
       </w:pPr>
+      <w:rPr/>
     </w:lvl>
     <w:lvl w:ilvl="8">
       <w:start w:val="1"/>
@@ -2017,6 +2048,7 @@
         </w:tabs>
         <w:ind w:left="3600" w:hanging="360"/>
       </w:pPr>
+      <w:rPr/>
     </w:lvl>
   </w:abstractNum>
   <w:abstractNum w:abstractNumId="5">
@@ -2044,6 +2076,7 @@
         </w:tabs>
         <w:ind w:left="1080" w:hanging="360"/>
       </w:pPr>
+      <w:rPr/>
     </w:lvl>
     <w:lvl w:ilvl="2">
       <w:start w:val="1"/>
@@ -2056,6 +2089,7 @@
         </w:tabs>
         <w:ind w:left="1440" w:hanging="360"/>
       </w:pPr>
+      <w:rPr/>
     </w:lvl>
     <w:lvl w:ilvl="3">
       <w:start w:val="1"/>
@@ -2068,6 +2102,7 @@
         </w:tabs>
         <w:ind w:left="1800" w:hanging="360"/>
       </w:pPr>
+      <w:rPr/>
     </w:lvl>
     <w:lvl w:ilvl="4">
       <w:start w:val="1"/>
@@ -2080,6 +2115,7 @@
         </w:tabs>
         <w:ind w:left="2160" w:hanging="360"/>
       </w:pPr>
+      <w:rPr/>
     </w:lvl>
     <w:lvl w:ilvl="5">
       <w:start w:val="1"/>
@@ -2092,6 +2128,7 @@
         </w:tabs>
         <w:ind w:left="2520" w:hanging="360"/>
       </w:pPr>
+      <w:rPr/>
     </w:lvl>
     <w:lvl w:ilvl="6">
       <w:start w:val="1"/>
@@ -2104,6 +2141,7 @@
         </w:tabs>
         <w:ind w:left="2880" w:hanging="360"/>
       </w:pPr>
+      <w:rPr/>
     </w:lvl>
     <w:lvl w:ilvl="7">
       <w:start w:val="1"/>
@@ -2116,6 +2154,7 @@
         </w:tabs>
         <w:ind w:left="3240" w:hanging="360"/>
       </w:pPr>
+      <w:rPr/>
     </w:lvl>
     <w:lvl w:ilvl="8">
       <w:start w:val="1"/>
@@ -2128,6 +2167,7 @@
         </w:tabs>
         <w:ind w:left="3600" w:hanging="360"/>
       </w:pPr>
+      <w:rPr/>
     </w:lvl>
   </w:abstractNum>
   <w:abstractNum w:abstractNumId="6">
@@ -2155,6 +2195,7 @@
         </w:tabs>
         <w:ind w:left="1080" w:hanging="360"/>
       </w:pPr>
+      <w:rPr/>
     </w:lvl>
     <w:lvl w:ilvl="2">
       <w:start w:val="1"/>
@@ -2167,6 +2208,7 @@
         </w:tabs>
         <w:ind w:left="1440" w:hanging="360"/>
       </w:pPr>
+      <w:rPr/>
     </w:lvl>
     <w:lvl w:ilvl="3">
       <w:start w:val="1"/>
@@ -2179,6 +2221,7 @@
         </w:tabs>
         <w:ind w:left="1800" w:hanging="360"/>
       </w:pPr>
+      <w:rPr/>
     </w:lvl>
     <w:lvl w:ilvl="4">
       <w:start w:val="1"/>
@@ -2191,6 +2234,7 @@
         </w:tabs>
         <w:ind w:left="2160" w:hanging="360"/>
       </w:pPr>
+      <w:rPr/>
     </w:lvl>
     <w:lvl w:ilvl="5">
       <w:start w:val="1"/>
@@ -2203,6 +2247,7 @@
         </w:tabs>
         <w:ind w:left="2520" w:hanging="360"/>
       </w:pPr>
+      <w:rPr/>
     </w:lvl>
     <w:lvl w:ilvl="6">
       <w:start w:val="1"/>
@@ -2215,6 +2260,7 @@
         </w:tabs>
         <w:ind w:left="2880" w:hanging="360"/>
       </w:pPr>
+      <w:rPr/>
     </w:lvl>
     <w:lvl w:ilvl="7">
       <w:start w:val="1"/>
@@ -2227,6 +2273,7 @@
         </w:tabs>
         <w:ind w:left="3240" w:hanging="360"/>
       </w:pPr>
+      <w:rPr/>
     </w:lvl>
     <w:lvl w:ilvl="8">
       <w:start w:val="1"/>
@@ -2239,6 +2286,7 @@
         </w:tabs>
         <w:ind w:left="3600" w:hanging="360"/>
       </w:pPr>
+      <w:rPr/>
     </w:lvl>
   </w:abstractNum>
   <w:abstractNum w:abstractNumId="7">
@@ -2389,7 +2437,7 @@
   <w:docDefaults>
     <w:rPrDefault>
       <w:rPr>
-        <w:rFonts w:ascii="Cambria" w:hAnsi="Cambria" w:eastAsia="ＭＳ 明朝" w:cs="" w:asciiTheme="minorHAnsi" w:cstheme="minorBidi" w:eastAsiaTheme="minorEastAsia" w:hAnsiTheme="minorHAnsi"/>
+        <w:rFonts w:ascii="Cambria" w:hAnsi="Cambria" w:eastAsia="" w:cs="" w:asciiTheme="minorHAnsi" w:cstheme="minorBidi" w:eastAsiaTheme="minorEastAsia" w:hAnsiTheme="minorHAnsi"/>
         <w:sz w:val="22"/>
         <w:szCs w:val="22"/>
         <w:lang w:val="en-US" w:eastAsia="en-US" w:bidi="ar-SA"/>
@@ -2546,6 +2594,7 @@
     <w:rsid w:val="00fc693f"/>
     <w:pPr>
       <w:widowControl/>
+      <w:suppressAutoHyphens w:val="true"/>
       <w:bidi w:val="0"/>
       <w:spacing w:lineRule="auto" w:line="276" w:before="0" w:after="0"/>
       <w:jc w:val="left"/>
@@ -2574,7 +2623,7 @@
       <w:outlineLvl w:val="0"/>
     </w:pPr>
     <w:rPr>
-      <w:rFonts w:ascii="Calibri" w:hAnsi="Calibri" w:eastAsia="ＭＳ ゴシック" w:cs="" w:asciiTheme="majorHAnsi" w:cstheme="majorBidi" w:eastAsiaTheme="majorEastAsia" w:hAnsiTheme="majorHAnsi"/>
+      <w:rFonts w:ascii="Calibri" w:hAnsi="Calibri" w:eastAsia="" w:cs="" w:asciiTheme="majorHAnsi" w:cstheme="majorBidi" w:eastAsiaTheme="majorEastAsia" w:hAnsiTheme="majorHAnsi"/>
       <w:b/>
       <w:bCs/>
       <w:color w:themeColor="accent1" w:themeShade="bf" w:val="365F91"/>
@@ -2598,7 +2647,7 @@
       <w:outlineLvl w:val="1"/>
     </w:pPr>
     <w:rPr>
-      <w:rFonts w:ascii="Calibri" w:hAnsi="Calibri" w:eastAsia="ＭＳ ゴシック" w:cs="" w:asciiTheme="majorHAnsi" w:cstheme="majorBidi" w:eastAsiaTheme="majorEastAsia" w:hAnsiTheme="majorHAnsi"/>
+      <w:rFonts w:ascii="Calibri" w:hAnsi="Calibri" w:eastAsia="" w:cs="" w:asciiTheme="majorHAnsi" w:cstheme="majorBidi" w:eastAsiaTheme="majorEastAsia" w:hAnsiTheme="majorHAnsi"/>
       <w:b/>
       <w:bCs/>
       <w:color w:themeColor="accent1" w:val="4F81BD"/>
@@ -2622,7 +2671,7 @@
       <w:outlineLvl w:val="2"/>
     </w:pPr>
     <w:rPr>
-      <w:rFonts w:ascii="Calibri" w:hAnsi="Calibri" w:eastAsia="ＭＳ ゴシック" w:cs="" w:asciiTheme="majorHAnsi" w:cstheme="majorBidi" w:eastAsiaTheme="majorEastAsia" w:hAnsiTheme="majorHAnsi"/>
+      <w:rFonts w:ascii="Calibri" w:hAnsi="Calibri" w:eastAsia="" w:cs="" w:asciiTheme="majorHAnsi" w:cstheme="majorBidi" w:eastAsiaTheme="majorEastAsia" w:hAnsiTheme="majorHAnsi"/>
       <w:b/>
       <w:bCs/>
       <w:color w:themeColor="accent1" w:val="4F81BD"/>
@@ -2645,7 +2694,7 @@
       <w:outlineLvl w:val="3"/>
     </w:pPr>
     <w:rPr>
-      <w:rFonts w:ascii="Calibri" w:hAnsi="Calibri" w:eastAsia="ＭＳ ゴシック" w:cs="" w:asciiTheme="majorHAnsi" w:cstheme="majorBidi" w:eastAsiaTheme="majorEastAsia" w:hAnsiTheme="majorHAnsi"/>
+      <w:rFonts w:ascii="Calibri" w:hAnsi="Calibri" w:eastAsia="" w:cs="" w:asciiTheme="majorHAnsi" w:cstheme="majorBidi" w:eastAsiaTheme="majorEastAsia" w:hAnsiTheme="majorHAnsi"/>
       <w:b/>
       <w:bCs/>
       <w:i/>
@@ -2670,7 +2719,7 @@
       <w:outlineLvl w:val="4"/>
     </w:pPr>
     <w:rPr>
-      <w:rFonts w:ascii="Calibri" w:hAnsi="Calibri" w:eastAsia="ＭＳ ゴシック" w:cs="" w:asciiTheme="majorHAnsi" w:cstheme="majorBidi" w:eastAsiaTheme="majorEastAsia" w:hAnsiTheme="majorHAnsi"/>
+      <w:rFonts w:ascii="Calibri" w:hAnsi="Calibri" w:eastAsia="" w:cs="" w:asciiTheme="majorHAnsi" w:cstheme="majorBidi" w:eastAsiaTheme="majorEastAsia" w:hAnsiTheme="majorHAnsi"/>
       <w:color w:themeColor="accent1" w:themeShade="7f" w:val="243F60"/>
     </w:rPr>
   </w:style>
@@ -2691,7 +2740,7 @@
       <w:outlineLvl w:val="5"/>
     </w:pPr>
     <w:rPr>
-      <w:rFonts w:ascii="Calibri" w:hAnsi="Calibri" w:eastAsia="ＭＳ ゴシック" w:cs="" w:asciiTheme="majorHAnsi" w:cstheme="majorBidi" w:eastAsiaTheme="majorEastAsia" w:hAnsiTheme="majorHAnsi"/>
+      <w:rFonts w:ascii="Calibri" w:hAnsi="Calibri" w:eastAsia="" w:cs="" w:asciiTheme="majorHAnsi" w:cstheme="majorBidi" w:eastAsiaTheme="majorEastAsia" w:hAnsiTheme="majorHAnsi"/>
       <w:i/>
       <w:iCs/>
       <w:color w:themeColor="accent1" w:themeShade="7f" w:val="243F60"/>
@@ -2714,7 +2763,7 @@
       <w:outlineLvl w:val="6"/>
     </w:pPr>
     <w:rPr>
-      <w:rFonts w:ascii="Calibri" w:hAnsi="Calibri" w:eastAsia="ＭＳ ゴシック" w:cs="" w:asciiTheme="majorHAnsi" w:cstheme="majorBidi" w:eastAsiaTheme="majorEastAsia" w:hAnsiTheme="majorHAnsi"/>
+      <w:rFonts w:ascii="Calibri" w:hAnsi="Calibri" w:eastAsia="" w:cs="" w:asciiTheme="majorHAnsi" w:cstheme="majorBidi" w:eastAsiaTheme="majorEastAsia" w:hAnsiTheme="majorHAnsi"/>
       <w:i/>
       <w:iCs/>
       <w:color w:themeColor="text1" w:themeTint="bf" w:val="404040"/>
@@ -2737,7 +2786,7 @@
       <w:outlineLvl w:val="7"/>
     </w:pPr>
     <w:rPr>
-      <w:rFonts w:ascii="Calibri" w:hAnsi="Calibri" w:eastAsia="ＭＳ ゴシック" w:cs="" w:asciiTheme="majorHAnsi" w:cstheme="majorBidi" w:eastAsiaTheme="majorEastAsia" w:hAnsiTheme="majorHAnsi"/>
+      <w:rFonts w:ascii="Calibri" w:hAnsi="Calibri" w:eastAsia="" w:cs="" w:asciiTheme="majorHAnsi" w:cstheme="majorBidi" w:eastAsiaTheme="majorEastAsia" w:hAnsiTheme="majorHAnsi"/>
       <w:color w:themeColor="accent1" w:val="4F81BD"/>
       <w:sz w:val="20"/>
       <w:szCs w:val="20"/>
@@ -2760,7 +2809,7 @@
       <w:outlineLvl w:val="8"/>
     </w:pPr>
     <w:rPr>
-      <w:rFonts w:ascii="Calibri" w:hAnsi="Calibri" w:eastAsia="ＭＳ ゴシック" w:cs="" w:asciiTheme="majorHAnsi" w:cstheme="majorBidi" w:eastAsiaTheme="majorEastAsia" w:hAnsiTheme="majorHAnsi"/>
+      <w:rFonts w:ascii="Calibri" w:hAnsi="Calibri" w:eastAsia="" w:cs="" w:asciiTheme="majorHAnsi" w:cstheme="majorBidi" w:eastAsiaTheme="majorEastAsia" w:hAnsiTheme="majorHAnsi"/>
       <w:i/>
       <w:iCs/>
       <w:color w:themeColor="text1" w:themeTint="bf" w:val="404040"/>
@@ -2802,7 +2851,7 @@
     <w:qFormat/>
     <w:rsid w:val="00fc693f"/>
     <w:rPr>
-      <w:rFonts w:ascii="Calibri" w:hAnsi="Calibri" w:eastAsia="ＭＳ ゴシック" w:cs="" w:asciiTheme="majorHAnsi" w:cstheme="majorBidi" w:eastAsiaTheme="majorEastAsia" w:hAnsiTheme="majorHAnsi"/>
+      <w:rFonts w:ascii="Calibri" w:hAnsi="Calibri" w:eastAsia="" w:cs="" w:asciiTheme="majorHAnsi" w:cstheme="majorBidi" w:eastAsiaTheme="majorEastAsia" w:hAnsiTheme="majorHAnsi"/>
       <w:b/>
       <w:bCs/>
       <w:color w:themeColor="accent1" w:themeShade="bf" w:val="365F91"/>
@@ -2818,7 +2867,7 @@
     <w:qFormat/>
     <w:rsid w:val="00fc693f"/>
     <w:rPr>
-      <w:rFonts w:ascii="Calibri" w:hAnsi="Calibri" w:eastAsia="ＭＳ ゴシック" w:cs="" w:asciiTheme="majorHAnsi" w:cstheme="majorBidi" w:eastAsiaTheme="majorEastAsia" w:hAnsiTheme="majorHAnsi"/>
+      <w:rFonts w:ascii="Calibri" w:hAnsi="Calibri" w:eastAsia="" w:cs="" w:asciiTheme="majorHAnsi" w:cstheme="majorBidi" w:eastAsiaTheme="majorEastAsia" w:hAnsiTheme="majorHAnsi"/>
       <w:b/>
       <w:bCs/>
       <w:color w:themeColor="accent1" w:val="4F81BD"/>
@@ -2834,7 +2883,7 @@
     <w:qFormat/>
     <w:rsid w:val="00fc693f"/>
     <w:rPr>
-      <w:rFonts w:ascii="Calibri" w:hAnsi="Calibri" w:eastAsia="ＭＳ ゴシック" w:cs="" w:asciiTheme="majorHAnsi" w:cstheme="majorBidi" w:eastAsiaTheme="majorEastAsia" w:hAnsiTheme="majorHAnsi"/>
+      <w:rFonts w:ascii="Calibri" w:hAnsi="Calibri" w:eastAsia="" w:cs="" w:asciiTheme="majorHAnsi" w:cstheme="majorBidi" w:eastAsiaTheme="majorEastAsia" w:hAnsiTheme="majorHAnsi"/>
       <w:b/>
       <w:bCs/>
       <w:color w:themeColor="accent1" w:val="4F81BD"/>
@@ -2848,7 +2897,7 @@
     <w:qFormat/>
     <w:rsid w:val="00fc693f"/>
     <w:rPr>
-      <w:rFonts w:ascii="Calibri" w:hAnsi="Calibri" w:eastAsia="ＭＳ ゴシック" w:cs="" w:asciiTheme="majorHAnsi" w:cstheme="majorBidi" w:eastAsiaTheme="majorEastAsia" w:hAnsiTheme="majorHAnsi"/>
+      <w:rFonts w:ascii="Calibri" w:hAnsi="Calibri" w:eastAsia="" w:cs="" w:asciiTheme="majorHAnsi" w:cstheme="majorBidi" w:eastAsiaTheme="majorEastAsia" w:hAnsiTheme="majorHAnsi"/>
       <w:color w:themeColor="text2" w:themeShade="bf" w:val="17365D"/>
       <w:spacing w:val="5"/>
       <w:kern w:val="2"/>
@@ -2864,7 +2913,7 @@
     <w:qFormat/>
     <w:rsid w:val="00fc693f"/>
     <w:rPr>
-      <w:rFonts w:ascii="Calibri" w:hAnsi="Calibri" w:eastAsia="ＭＳ ゴシック" w:cs="" w:asciiTheme="majorHAnsi" w:cstheme="majorBidi" w:eastAsiaTheme="majorEastAsia" w:hAnsiTheme="majorHAnsi"/>
+      <w:rFonts w:ascii="Calibri" w:hAnsi="Calibri" w:eastAsia="" w:cs="" w:asciiTheme="majorHAnsi" w:cstheme="majorBidi" w:eastAsiaTheme="majorEastAsia" w:hAnsiTheme="majorHAnsi"/>
       <w:i/>
       <w:iCs/>
       <w:color w:themeColor="accent1" w:val="4F81BD"/>
@@ -2937,7 +2986,7 @@
     <w:qFormat/>
     <w:rsid w:val="00fc693f"/>
     <w:rPr>
-      <w:rFonts w:ascii="Calibri" w:hAnsi="Calibri" w:eastAsia="ＭＳ ゴシック" w:cs="" w:asciiTheme="majorHAnsi" w:cstheme="majorBidi" w:eastAsiaTheme="majorEastAsia" w:hAnsiTheme="majorHAnsi"/>
+      <w:rFonts w:ascii="Calibri" w:hAnsi="Calibri" w:eastAsia="" w:cs="" w:asciiTheme="majorHAnsi" w:cstheme="majorBidi" w:eastAsiaTheme="majorEastAsia" w:hAnsiTheme="majorHAnsi"/>
       <w:b/>
       <w:bCs/>
       <w:i/>
@@ -2954,7 +3003,7 @@
     <w:qFormat/>
     <w:rsid w:val="00fc693f"/>
     <w:rPr>
-      <w:rFonts w:ascii="Calibri" w:hAnsi="Calibri" w:eastAsia="ＭＳ ゴシック" w:cs="" w:asciiTheme="majorHAnsi" w:cstheme="majorBidi" w:eastAsiaTheme="majorEastAsia" w:hAnsiTheme="majorHAnsi"/>
+      <w:rFonts w:ascii="Calibri" w:hAnsi="Calibri" w:eastAsia="" w:cs="" w:asciiTheme="majorHAnsi" w:cstheme="majorBidi" w:eastAsiaTheme="majorEastAsia" w:hAnsiTheme="majorHAnsi"/>
       <w:color w:themeColor="accent1" w:themeShade="7f" w:val="243F60"/>
     </w:rPr>
   </w:style>
@@ -2967,7 +3016,7 @@
     <w:qFormat/>
     <w:rsid w:val="00fc693f"/>
     <w:rPr>
-      <w:rFonts w:ascii="Calibri" w:hAnsi="Calibri" w:eastAsia="ＭＳ ゴシック" w:cs="" w:asciiTheme="majorHAnsi" w:cstheme="majorBidi" w:eastAsiaTheme="majorEastAsia" w:hAnsiTheme="majorHAnsi"/>
+      <w:rFonts w:ascii="Calibri" w:hAnsi="Calibri" w:eastAsia="" w:cs="" w:asciiTheme="majorHAnsi" w:cstheme="majorBidi" w:eastAsiaTheme="majorEastAsia" w:hAnsiTheme="majorHAnsi"/>
       <w:i/>
       <w:iCs/>
       <w:color w:themeColor="accent1" w:themeShade="7f" w:val="243F60"/>
@@ -2982,7 +3031,7 @@
     <w:qFormat/>
     <w:rsid w:val="00fc693f"/>
     <w:rPr>
-      <w:rFonts w:ascii="Calibri" w:hAnsi="Calibri" w:eastAsia="ＭＳ ゴシック" w:cs="" w:asciiTheme="majorHAnsi" w:cstheme="majorBidi" w:eastAsiaTheme="majorEastAsia" w:hAnsiTheme="majorHAnsi"/>
+      <w:rFonts w:ascii="Calibri" w:hAnsi="Calibri" w:eastAsia="" w:cs="" w:asciiTheme="majorHAnsi" w:cstheme="majorBidi" w:eastAsiaTheme="majorEastAsia" w:hAnsiTheme="majorHAnsi"/>
       <w:i/>
       <w:iCs/>
       <w:color w:themeColor="text1" w:themeTint="bf" w:val="404040"/>
@@ -2997,7 +3046,7 @@
     <w:qFormat/>
     <w:rsid w:val="00fc693f"/>
     <w:rPr>
-      <w:rFonts w:ascii="Calibri" w:hAnsi="Calibri" w:eastAsia="ＭＳ ゴシック" w:cs="" w:asciiTheme="majorHAnsi" w:cstheme="majorBidi" w:eastAsiaTheme="majorEastAsia" w:hAnsiTheme="majorHAnsi"/>
+      <w:rFonts w:ascii="Calibri" w:hAnsi="Calibri" w:eastAsia="" w:cs="" w:asciiTheme="majorHAnsi" w:cstheme="majorBidi" w:eastAsiaTheme="majorEastAsia" w:hAnsiTheme="majorHAnsi"/>
       <w:color w:themeColor="accent1" w:val="4F81BD"/>
       <w:sz w:val="20"/>
       <w:szCs w:val="20"/>
@@ -3012,7 +3061,7 @@
     <w:qFormat/>
     <w:rsid w:val="00fc693f"/>
     <w:rPr>
-      <w:rFonts w:ascii="Calibri" w:hAnsi="Calibri" w:eastAsia="ＭＳ ゴシック" w:cs="" w:asciiTheme="majorHAnsi" w:cstheme="majorBidi" w:eastAsiaTheme="majorEastAsia" w:hAnsiTheme="majorHAnsi"/>
+      <w:rFonts w:ascii="Calibri" w:hAnsi="Calibri" w:eastAsia="" w:cs="" w:asciiTheme="majorHAnsi" w:cstheme="majorBidi" w:eastAsiaTheme="majorEastAsia" w:hAnsiTheme="majorHAnsi"/>
       <w:i/>
       <w:iCs/>
       <w:color w:themeColor="text1" w:themeTint="bf" w:val="404040"/>
@@ -3242,12 +3291,13 @@
     <w:rsid w:val="00fc693f"/>
     <w:pPr>
       <w:widowControl/>
+      <w:suppressAutoHyphens w:val="true"/>
       <w:bidi w:val="0"/>
       <w:spacing w:lineRule="auto" w:line="240" w:before="0" w:after="0"/>
       <w:jc w:val="left"/>
     </w:pPr>
     <w:rPr>
-      <w:rFonts w:ascii="Cambria" w:hAnsi="Cambria" w:eastAsia="ＭＳ 明朝" w:cs="" w:asciiTheme="minorHAnsi" w:cstheme="minorBidi" w:eastAsiaTheme="minorEastAsia" w:hAnsiTheme="minorHAnsi"/>
+      <w:rFonts w:ascii="Cambria" w:hAnsi="Cambria" w:eastAsia="" w:cs="" w:asciiTheme="minorHAnsi" w:cstheme="minorBidi" w:eastAsiaTheme="minorEastAsia" w:hAnsiTheme="minorHAnsi"/>
       <w:color w:val="auto"/>
       <w:kern w:val="0"/>
       <w:sz w:val="22"/>
@@ -3271,7 +3321,7 @@
       <w:contextualSpacing/>
     </w:pPr>
     <w:rPr>
-      <w:rFonts w:ascii="Calibri" w:hAnsi="Calibri" w:eastAsia="ＭＳ ゴシック" w:cs="" w:asciiTheme="majorHAnsi" w:cstheme="majorBidi" w:eastAsiaTheme="majorEastAsia" w:hAnsiTheme="majorHAnsi"/>
+      <w:rFonts w:ascii="Calibri" w:hAnsi="Calibri" w:eastAsia="" w:cs="" w:asciiTheme="majorHAnsi" w:cstheme="majorBidi" w:eastAsiaTheme="majorEastAsia" w:hAnsiTheme="majorHAnsi"/>
       <w:color w:themeColor="text2" w:themeShade="bf" w:val="17365D"/>
       <w:spacing w:val="5"/>
       <w:kern w:val="2"/>
@@ -3289,7 +3339,7 @@
     <w:rsid w:val="00fc693f"/>
     <w:pPr/>
     <w:rPr>
-      <w:rFonts w:ascii="Calibri" w:hAnsi="Calibri" w:eastAsia="ＭＳ ゴシック" w:cs="" w:asciiTheme="majorHAnsi" w:cstheme="majorBidi" w:eastAsiaTheme="majorEastAsia" w:hAnsiTheme="majorHAnsi"/>
+      <w:rFonts w:ascii="Calibri" w:hAnsi="Calibri" w:eastAsia="" w:cs="" w:asciiTheme="majorHAnsi" w:cstheme="majorBidi" w:eastAsiaTheme="majorEastAsia" w:hAnsiTheme="majorHAnsi"/>
       <w:i/>
       <w:iCs/>
       <w:color w:themeColor="accent1" w:val="4F81BD"/>
@@ -3522,12 +3572,13 @@
         <w:tab w:val="left" w:pos="3456" w:leader="none"/>
         <w:tab w:val="left" w:pos="4032" w:leader="none"/>
       </w:tabs>
+      <w:suppressAutoHyphens w:val="true"/>
       <w:bidi w:val="0"/>
       <w:spacing w:lineRule="auto" w:line="276" w:before="0" w:after="200"/>
       <w:jc w:val="left"/>
     </w:pPr>
     <w:rPr>
-      <w:rFonts w:ascii="Courier" w:hAnsi="Courier" w:eastAsia="ＭＳ 明朝" w:cs="" w:cstheme="minorBidi" w:eastAsiaTheme="minorEastAsia"/>
+      <w:rFonts w:ascii="Courier" w:hAnsi="Courier" w:eastAsia="" w:cs="" w:cstheme="minorBidi" w:eastAsiaTheme="minorEastAsia"/>
       <w:color w:val="auto"/>
       <w:kern w:val="0"/>
       <w:sz w:val="20"/>
@@ -6725,7 +6776,6 @@
       <w:pPr>
         <w:spacing w:before="0" w:after="0" w:line="240" w:lineRule="auto"/>
       </w:pPr>
-      <w:rPr/>
       <w:tblPr/>
       <w:tcPr>
         <w:tcBorders>
@@ -6871,7 +6921,6 @@
       <w:pPr>
         <w:spacing w:before="0" w:after="0" w:line="240" w:lineRule="auto"/>
       </w:pPr>
-      <w:rPr/>
       <w:tblPr/>
       <w:tcPr>
         <w:tcBorders>
@@ -7017,7 +7066,6 @@
       <w:pPr>
         <w:spacing w:before="0" w:after="0" w:line="240" w:lineRule="auto"/>
       </w:pPr>
-      <w:rPr/>
       <w:tblPr/>
       <w:tcPr>
         <w:tcBorders>
@@ -7163,7 +7211,6 @@
       <w:pPr>
         <w:spacing w:before="0" w:after="0" w:line="240" w:lineRule="auto"/>
       </w:pPr>
-      <w:rPr/>
       <w:tblPr/>
       <w:tcPr>
         <w:tcBorders>
@@ -7309,7 +7356,6 @@
       <w:pPr>
         <w:spacing w:before="0" w:after="0" w:line="240" w:lineRule="auto"/>
       </w:pPr>
-      <w:rPr/>
       <w:tblPr/>
       <w:tcPr>
         <w:tcBorders>
@@ -7455,7 +7501,6 @@
       <w:pPr>
         <w:spacing w:before="0" w:after="0" w:line="240" w:lineRule="auto"/>
       </w:pPr>
-      <w:rPr/>
       <w:tblPr/>
       <w:tcPr>
         <w:tcBorders>
@@ -7601,7 +7646,6 @@
       <w:pPr>
         <w:spacing w:before="0" w:after="0" w:line="240" w:lineRule="auto"/>
       </w:pPr>
-      <w:rPr/>
       <w:tblPr/>
       <w:tcPr>
         <w:tcBorders>

</xml_diff>